<commit_message>
Adding UK average public charging prices to the display when electric car is selected (and opening up the option for other countries -  add 'publicCharging' to the countryPrices)
</commit_message>
<xml_diff>
--- a/Change log.docx
+++ b/Change log.docx
@@ -1,6 +1,6 @@
 
 <file path=word/document.xml><?xml version="1.0" encoding="utf-8"?>
-<w:document xmlns:wpc="http://schemas.microsoft.com/office/word/2010/wordprocessingCanvas" xmlns:cx="http://schemas.microsoft.com/office/drawing/2014/chartex" xmlns:cx1="http://schemas.microsoft.com/office/drawing/2015/9/8/chartex" xmlns:cx2="http://schemas.microsoft.com/office/drawing/2015/10/21/chartex" xmlns:cx3="http://schemas.microsoft.com/office/drawing/2016/5/9/chartex" xmlns:cx4="http://schemas.microsoft.com/office/drawing/2016/5/10/chartex" xmlns:cx5="http://schemas.microsoft.com/office/drawing/2016/5/11/chartex" xmlns:cx6="http://schemas.microsoft.com/office/drawing/2016/5/12/chartex" xmlns:cx7="http://schemas.microsoft.com/office/drawing/2016/5/13/chartex" xmlns:cx8="http://schemas.microsoft.com/office/drawing/2016/5/14/chartex" xmlns:mc="http://schemas.openxmlformats.org/markup-compatibility/2006" xmlns:aink="http://schemas.microsoft.com/office/drawing/2016/ink" xmlns:am3d="http://schemas.microsoft.com/office/drawing/2017/model3d" xmlns:o="urn:schemas-microsoft-com:office:office" xmlns:oel="http://schemas.microsoft.com/office/2019/extlst" xmlns:r="http://schemas.openxmlformats.org/officeDocument/2006/relationships" xmlns:m="http://schemas.openxmlformats.org/officeDocument/2006/math" xmlns:v="urn:schemas-microsoft-com:vml" xmlns:wp14="http://schemas.microsoft.com/office/word/2010/wordprocessingDrawing" xmlns:wp="http://schemas.openxmlformats.org/drawingml/2006/wordprocessingDrawing" xmlns:w10="urn:schemas-microsoft-com:office:word" xmlns:w="http://schemas.openxmlformats.org/wordprocessingml/2006/main" xmlns:w14="http://schemas.microsoft.com/office/word/2010/wordml" xmlns:w15="http://schemas.microsoft.com/office/word/2012/wordml" xmlns:w16cex="http://schemas.microsoft.com/office/word/2018/wordml/cex" xmlns:w16cid="http://schemas.microsoft.com/office/word/2016/wordml/cid" xmlns:w16="http://schemas.microsoft.com/office/word/2018/wordml" xmlns:w16du="http://schemas.microsoft.com/office/word/2023/wordml/word16du" xmlns:w16sdtdh="http://schemas.microsoft.com/office/word/2020/wordml/sdtdatahash" xmlns:w16sdtfl="http://schemas.microsoft.com/office/word/2024/wordml/sdtformatlock" xmlns:w16se="http://schemas.microsoft.com/office/word/2015/wordml/symex" xmlns:wpg="http://schemas.microsoft.com/office/word/2010/wordprocessingGroup" xmlns:wpi="http://schemas.microsoft.com/office/word/2010/wordprocessingInk" xmlns:wne="http://schemas.microsoft.com/office/word/2006/wordml" xmlns:wps="http://schemas.microsoft.com/office/word/2010/wordprocessingShape" mc:Ignorable="w14 w15 w16se w16cid w16 w16cex w16sdtdh w16sdtfl w16du wp14">
+<w:document xmlns:wpc="http://schemas.microsoft.com/office/word/2010/wordprocessingCanvas" xmlns:cx="http://schemas.microsoft.com/office/drawing/2014/chartex" xmlns:cx1="http://schemas.microsoft.com/office/drawing/2015/9/8/chartex" xmlns:cx2="http://schemas.microsoft.com/office/drawing/2015/10/21/chartex" xmlns:cx3="http://schemas.microsoft.com/office/drawing/2016/5/9/chartex" xmlns:cx4="http://schemas.microsoft.com/office/drawing/2016/5/10/chartex" xmlns:cx5="http://schemas.microsoft.com/office/drawing/2016/5/11/chartex" xmlns:cx6="http://schemas.microsoft.com/office/drawing/2016/5/12/chartex" xmlns:cx7="http://schemas.microsoft.com/office/drawing/2016/5/13/chartex" xmlns:cx8="http://schemas.microsoft.com/office/drawing/2016/5/14/chartex" xmlns:mc="http://schemas.openxmlformats.org/markup-compatibility/2006" xmlns:aink="http://schemas.microsoft.com/office/drawing/2016/ink" xmlns:am3d="http://schemas.microsoft.com/office/drawing/2017/model3d" xmlns:o="urn:schemas-microsoft-com:office:office" xmlns:r="http://schemas.openxmlformats.org/officeDocument/2006/relationships" xmlns:m="http://schemas.openxmlformats.org/officeDocument/2006/math" xmlns:v="urn:schemas-microsoft-com:vml" xmlns:wp14="http://schemas.microsoft.com/office/word/2010/wordprocessingDrawing" xmlns:wp="http://schemas.openxmlformats.org/drawingml/2006/wordprocessingDrawing" xmlns:w10="urn:schemas-microsoft-com:office:word" xmlns:w="http://schemas.openxmlformats.org/wordprocessingml/2006/main" xmlns:w14="http://schemas.microsoft.com/office/word/2010/wordml" xmlns:w15="http://schemas.microsoft.com/office/word/2012/wordml" xmlns:w16cex="http://schemas.microsoft.com/office/word/2018/wordml/cex" xmlns:w16cid="http://schemas.microsoft.com/office/word/2016/wordml/cid" xmlns:w16="http://schemas.microsoft.com/office/word/2018/wordml" xmlns:w16sdtdh="http://schemas.microsoft.com/office/word/2020/wordml/sdtdatahash" xmlns:w16se="http://schemas.microsoft.com/office/word/2015/wordml/symex" xmlns:wpg="http://schemas.microsoft.com/office/word/2010/wordprocessingGroup" xmlns:wpi="http://schemas.microsoft.com/office/word/2010/wordprocessingInk" xmlns:wne="http://schemas.microsoft.com/office/word/2006/wordml" xmlns:wps="http://schemas.microsoft.com/office/word/2010/wordprocessingShape" mc:Ignorable="w14 w15 w16se w16cid w16 w16cex w16sdtdh wp14">
   <w:body>
     <w:p>
       <w:pPr>
@@ -17,85 +17,61 @@
           <w:sz w:val="24"/>
           <w:szCs w:val="24"/>
         </w:rPr>
-        <w:t xml:space="preserve">I appreciate </w:t>
-      </w:r>
-      <w:proofErr w:type="gramStart"/>
-      <w:r>
+        <w:t>I appreciate all of the feedback and comments from users. I continue to implement fixes and updates based on these suggestions.</w:t>
+      </w:r>
+    </w:p>
+    <w:p>
+      <w:pPr>
+        <w:pStyle w:val="PlainText"/>
         <w:rPr>
           <w:rFonts w:ascii="Courier New" w:hAnsi="Courier New" w:cs="Courier New"/>
           <w:sz w:val="24"/>
           <w:szCs w:val="24"/>
         </w:rPr>
-        <w:t>all of</w:t>
-      </w:r>
-      <w:proofErr w:type="gramEnd"/>
-      <w:r>
+      </w:pPr>
+    </w:p>
+    <w:p>
+      <w:pPr>
+        <w:pStyle w:val="PlainText"/>
         <w:rPr>
           <w:rFonts w:ascii="Courier New" w:hAnsi="Courier New" w:cs="Courier New"/>
           <w:sz w:val="24"/>
           <w:szCs w:val="24"/>
         </w:rPr>
-        <w:t xml:space="preserve"> the feedback and comments from users. I continue to implement fixes and updates based on these suggestions.</w:t>
-      </w:r>
-    </w:p>
-    <w:p>
-      <w:pPr>
-        <w:pStyle w:val="PlainText"/>
+      </w:pPr>
+      <w:r>
         <w:rPr>
           <w:rFonts w:ascii="Courier New" w:hAnsi="Courier New" w:cs="Courier New"/>
           <w:sz w:val="24"/>
           <w:szCs w:val="24"/>
         </w:rPr>
-      </w:pPr>
-    </w:p>
-    <w:p>
-      <w:pPr>
-        <w:pStyle w:val="PlainText"/>
+        <w:t>Here is a log of changes</w:t>
+      </w:r>
+      <w:r>
         <w:rPr>
           <w:rFonts w:ascii="Courier New" w:hAnsi="Courier New" w:cs="Courier New"/>
           <w:sz w:val="24"/>
           <w:szCs w:val="24"/>
         </w:rPr>
-      </w:pPr>
+        <w:t xml:space="preserve"> and </w:t>
+      </w:r>
       <w:r>
         <w:rPr>
           <w:rFonts w:ascii="Courier New" w:hAnsi="Courier New" w:cs="Courier New"/>
           <w:sz w:val="24"/>
           <w:szCs w:val="24"/>
         </w:rPr>
-        <w:t>Here is a log of changes</w:t>
-      </w:r>
-      <w:r>
+        <w:t>improvements.</w:t>
+      </w:r>
+    </w:p>
+    <w:p>
+      <w:pPr>
+        <w:pStyle w:val="PlainText"/>
         <w:rPr>
           <w:rFonts w:ascii="Courier New" w:hAnsi="Courier New" w:cs="Courier New"/>
           <w:sz w:val="24"/>
           <w:szCs w:val="24"/>
         </w:rPr>
-        <w:t xml:space="preserve"> and </w:t>
-      </w:r>
-      <w:r>
-        <w:rPr>
-          <w:rFonts w:ascii="Courier New" w:hAnsi="Courier New" w:cs="Courier New"/>
-          <w:sz w:val="24"/>
-          <w:szCs w:val="24"/>
-        </w:rPr>
-        <w:t>improvements.</w:t>
-      </w:r>
-    </w:p>
-    <w:p>
-      <w:pPr>
-        <w:pStyle w:val="PlainText"/>
-        <w:rPr>
-          <w:rFonts w:ascii="Courier New" w:hAnsi="Courier New" w:cs="Courier New"/>
-        </w:rPr>
-      </w:pPr>
-    </w:p>
-    <w:p>
-      <w:pPr>
-        <w:pStyle w:val="PlainText"/>
-        <w:rPr>
-          <w:rFonts w:ascii="Courier New" w:hAnsi="Courier New" w:cs="Courier New"/>
-        </w:rPr>
       </w:pPr>
     </w:p>
     <w:p>
@@ -127,7 +103,7 @@
           <w:b/>
           <w:bCs/>
         </w:rPr>
-        <w:t>2</w:t>
+        <w:t>05</w:t>
       </w:r>
       <w:r>
         <w:rPr>
@@ -135,7 +111,7 @@
           <w:b/>
           <w:bCs/>
         </w:rPr>
-        <w:t>2</w:t>
+        <w:t>/0</w:t>
       </w:r>
       <w:r>
         <w:rPr>
@@ -143,7 +119,15 @@
           <w:b/>
           <w:bCs/>
         </w:rPr>
-        <w:t>/02/20</w:t>
+        <w:t>3</w:t>
+      </w:r>
+      <w:r>
+        <w:rPr>
+          <w:rFonts w:ascii="Courier New" w:hAnsi="Courier New" w:cs="Courier New"/>
+          <w:b/>
+          <w:bCs/>
+        </w:rPr>
+        <w:t>/20</w:t>
       </w:r>
       <w:r>
         <w:rPr>
@@ -203,84 +187,102 @@
           <w:sz w:val="24"/>
           <w:szCs w:val="24"/>
         </w:rPr>
-        <w:t xml:space="preserve">Added </w:t>
-      </w:r>
-      <w:proofErr w:type="spellStart"/>
-      <w:r>
-        <w:rPr>
-          <w:rFonts w:ascii="Courier New" w:hAnsi="Courier New" w:cs="Courier New"/>
-          <w:sz w:val="24"/>
-          <w:szCs w:val="24"/>
-        </w:rPr>
-        <w:t>Dehumidifer</w:t>
-      </w:r>
-      <w:proofErr w:type="spellEnd"/>
-      <w:r>
-        <w:rPr>
-          <w:rFonts w:ascii="Courier New" w:hAnsi="Courier New" w:cs="Courier New"/>
-          <w:sz w:val="24"/>
-          <w:szCs w:val="24"/>
-        </w:rPr>
-        <w:t xml:space="preserve">, Power </w:t>
-      </w:r>
-      <w:proofErr w:type="spellStart"/>
-      <w:r>
-        <w:rPr>
-          <w:rFonts w:ascii="Courier New" w:hAnsi="Courier New" w:cs="Courier New"/>
-          <w:sz w:val="24"/>
-          <w:szCs w:val="24"/>
-        </w:rPr>
-        <w:t>Strimmers</w:t>
-      </w:r>
-      <w:proofErr w:type="spellEnd"/>
-      <w:r>
-        <w:rPr>
-          <w:rFonts w:ascii="Courier New" w:hAnsi="Courier New" w:cs="Courier New"/>
-          <w:sz w:val="24"/>
-          <w:szCs w:val="24"/>
-        </w:rPr>
-        <w:t xml:space="preserve">, </w:t>
-      </w:r>
-      <w:r>
-        <w:rPr>
-          <w:rFonts w:ascii="Courier New" w:hAnsi="Courier New" w:cs="Courier New"/>
-          <w:sz w:val="24"/>
-          <w:szCs w:val="24"/>
-        </w:rPr>
-        <w:t xml:space="preserve">Power Washer, </w:t>
-      </w:r>
-      <w:r>
-        <w:rPr>
-          <w:rFonts w:ascii="Courier New" w:hAnsi="Courier New" w:cs="Courier New"/>
-          <w:sz w:val="24"/>
-          <w:szCs w:val="24"/>
-        </w:rPr>
-        <w:t>and Electric shower (with heat pump)</w:t>
-      </w:r>
-      <w:r>
-        <w:rPr>
-          <w:rFonts w:ascii="Courier New" w:hAnsi="Courier New" w:cs="Courier New"/>
-          <w:sz w:val="24"/>
-          <w:szCs w:val="24"/>
-        </w:rPr>
-        <w:t xml:space="preserve"> as new selection option</w:t>
-      </w:r>
-      <w:r>
-        <w:rPr>
-          <w:rFonts w:ascii="Courier New" w:hAnsi="Courier New" w:cs="Courier New"/>
-          <w:sz w:val="24"/>
-          <w:szCs w:val="24"/>
-        </w:rPr>
-        <w:t>s</w:t>
-      </w:r>
-      <w:r>
-        <w:rPr>
-          <w:rFonts w:ascii="Courier New" w:hAnsi="Courier New" w:cs="Courier New"/>
-          <w:sz w:val="24"/>
-          <w:szCs w:val="24"/>
-        </w:rPr>
-        <w:t>.</w:t>
-      </w:r>
+        <w:t>Added UK electric car public charging to canvas when looking at costings</w:t>
+      </w:r>
+    </w:p>
+    <w:p>
+      <w:pPr>
+        <w:pStyle w:val="PlainText"/>
+        <w:rPr>
+          <w:rFonts w:ascii="Courier New" w:hAnsi="Courier New" w:cs="Courier New"/>
+        </w:rPr>
+      </w:pPr>
+    </w:p>
+    <w:p>
+      <w:pPr>
+        <w:pStyle w:val="PlainText"/>
+        <w:rPr>
+          <w:rFonts w:ascii="Courier New" w:hAnsi="Courier New" w:cs="Courier New"/>
+        </w:rPr>
+      </w:pPr>
+      <w:r>
+        <w:rPr>
+          <w:rFonts w:ascii="Courier New" w:hAnsi="Courier New" w:cs="Courier New"/>
+        </w:rPr>
+        <w:t>========================================</w:t>
+      </w:r>
+    </w:p>
+    <w:p>
+      <w:pPr>
+        <w:pStyle w:val="PlainText"/>
+        <w:rPr>
+          <w:rFonts w:ascii="Courier New" w:hAnsi="Courier New" w:cs="Courier New"/>
+          <w:b/>
+          <w:bCs/>
+        </w:rPr>
+      </w:pPr>
+      <w:r>
+        <w:rPr>
+          <w:rFonts w:ascii="Courier New" w:hAnsi="Courier New" w:cs="Courier New"/>
+          <w:b/>
+          <w:bCs/>
+        </w:rPr>
+        <w:t>2</w:t>
+      </w:r>
+      <w:r>
+        <w:rPr>
+          <w:rFonts w:ascii="Courier New" w:hAnsi="Courier New" w:cs="Courier New"/>
+          <w:b/>
+          <w:bCs/>
+        </w:rPr>
+        <w:t>2</w:t>
+      </w:r>
+      <w:r>
+        <w:rPr>
+          <w:rFonts w:ascii="Courier New" w:hAnsi="Courier New" w:cs="Courier New"/>
+          <w:b/>
+          <w:bCs/>
+        </w:rPr>
+        <w:t>/02/20</w:t>
+      </w:r>
+      <w:r>
+        <w:rPr>
+          <w:rFonts w:ascii="Courier New" w:hAnsi="Courier New" w:cs="Courier New"/>
+          <w:b/>
+          <w:bCs/>
+        </w:rPr>
+        <w:t>2</w:t>
+      </w:r>
+      <w:r>
+        <w:rPr>
+          <w:rFonts w:ascii="Courier New" w:hAnsi="Courier New" w:cs="Courier New"/>
+          <w:b/>
+          <w:bCs/>
+        </w:rPr>
+        <w:t xml:space="preserve">6 </w:t>
+      </w:r>
+    </w:p>
+    <w:p>
+      <w:pPr>
+        <w:pStyle w:val="PlainText"/>
+        <w:rPr>
+          <w:rFonts w:ascii="Courier New" w:hAnsi="Courier New" w:cs="Courier New"/>
+        </w:rPr>
+      </w:pPr>
+      <w:r>
+        <w:rPr>
+          <w:rFonts w:ascii="Courier New" w:hAnsi="Courier New" w:cs="Courier New"/>
+        </w:rPr>
+        <w:t>========================================</w:t>
+      </w:r>
+    </w:p>
+    <w:p>
+      <w:pPr>
+        <w:pStyle w:val="PlainText"/>
+        <w:rPr>
+          <w:rFonts w:ascii="Courier New" w:hAnsi="Courier New" w:cs="Courier New"/>
+        </w:rPr>
+      </w:pPr>
     </w:p>
     <w:p>
       <w:pPr>
@@ -301,25 +303,77 @@
           <w:sz w:val="24"/>
           <w:szCs w:val="24"/>
         </w:rPr>
-        <w:t xml:space="preserve">Updated figures for Streaming Netflix and YouTube. The previous figure of 18 – 20 </w:t>
-      </w:r>
-      <w:proofErr w:type="spellStart"/>
+        <w:t xml:space="preserve">Added </w:t>
+      </w:r>
       <w:r>
         <w:rPr>
           <w:rFonts w:ascii="Courier New" w:hAnsi="Courier New" w:cs="Courier New"/>
           <w:sz w:val="24"/>
           <w:szCs w:val="24"/>
         </w:rPr>
-        <w:t>Wh</w:t>
-      </w:r>
-      <w:proofErr w:type="spellEnd"/>
+        <w:t xml:space="preserve">Dehumidifer, Power Strimmers, </w:t>
+      </w:r>
       <w:r>
         <w:rPr>
           <w:rFonts w:ascii="Courier New" w:hAnsi="Courier New" w:cs="Courier New"/>
           <w:sz w:val="24"/>
           <w:szCs w:val="24"/>
         </w:rPr>
-        <w:t xml:space="preserve"> per hour did not accurately reflect the </w:t>
+        <w:t xml:space="preserve">Power Washer, </w:t>
+      </w:r>
+      <w:r>
+        <w:rPr>
+          <w:rFonts w:ascii="Courier New" w:hAnsi="Courier New" w:cs="Courier New"/>
+          <w:sz w:val="24"/>
+          <w:szCs w:val="24"/>
+        </w:rPr>
+        <w:t>and Electric shower (with heat pump)</w:t>
+      </w:r>
+      <w:r>
+        <w:rPr>
+          <w:rFonts w:ascii="Courier New" w:hAnsi="Courier New" w:cs="Courier New"/>
+          <w:sz w:val="24"/>
+          <w:szCs w:val="24"/>
+        </w:rPr>
+        <w:t xml:space="preserve"> as new selection option</w:t>
+      </w:r>
+      <w:r>
+        <w:rPr>
+          <w:rFonts w:ascii="Courier New" w:hAnsi="Courier New" w:cs="Courier New"/>
+          <w:sz w:val="24"/>
+          <w:szCs w:val="24"/>
+        </w:rPr>
+        <w:t>s</w:t>
+      </w:r>
+      <w:r>
+        <w:rPr>
+          <w:rFonts w:ascii="Courier New" w:hAnsi="Courier New" w:cs="Courier New"/>
+          <w:sz w:val="24"/>
+          <w:szCs w:val="24"/>
+        </w:rPr>
+        <w:t>.</w:t>
+      </w:r>
+    </w:p>
+    <w:p>
+      <w:pPr>
+        <w:pStyle w:val="PlainText"/>
+        <w:numPr>
+          <w:ilvl w:val="0"/>
+          <w:numId w:val="9"/>
+        </w:numPr>
+        <w:rPr>
+          <w:rFonts w:ascii="Courier New" w:hAnsi="Courier New" w:cs="Courier New"/>
+          <w:sz w:val="24"/>
+          <w:szCs w:val="24"/>
+        </w:rPr>
+      </w:pPr>
+      <w:r>
+        <w:rPr>
+          <w:rFonts w:ascii="Courier New" w:hAnsi="Courier New" w:cs="Courier New"/>
+          <w:sz w:val="24"/>
+          <w:szCs w:val="24"/>
+        </w:rPr>
+        <w:t xml:space="preserve">Updated figures for Streaming Netflix and YouTube. The previous figure of 18 – 20 Wh per hour did not accurately reflect the </w:t>
       </w:r>
       <w:r>
         <w:rPr>
@@ -467,21 +521,7 @@
         <w:rPr>
           <w:rFonts w:ascii="Courier New" w:hAnsi="Courier New" w:cs="Courier New"/>
         </w:rPr>
-        <w:t xml:space="preserve">Updated figures for “Using an e-bike”. Previous figures assumed a usage of 25 watt-hours per mile. This is more reflective of heavy assistance on </w:t>
-      </w:r>
-      <w:proofErr w:type="gramStart"/>
-      <w:r>
-        <w:rPr>
-          <w:rFonts w:ascii="Courier New" w:hAnsi="Courier New" w:cs="Courier New"/>
-        </w:rPr>
-        <w:t>fairly hilly</w:t>
-      </w:r>
-      <w:proofErr w:type="gramEnd"/>
-      <w:r>
-        <w:rPr>
-          <w:rFonts w:ascii="Courier New" w:hAnsi="Courier New" w:cs="Courier New"/>
-        </w:rPr>
-        <w:t xml:space="preserve"> terrain. Moderate assist is closer to 15 watt-hours (which is the figure I now use).</w:t>
+        <w:t>Updated figures for “Using an e-bike”. Previous figures assumed a usage of 25 watt-hours per mile. This is more reflective of heavy assistance on fairly hilly terrain. Moderate assist is closer to 15 watt-hours (which is the figure I now use).</w:t>
       </w:r>
     </w:p>
     <w:p>
@@ -643,21 +683,8 @@
         <w:rPr>
           <w:rFonts w:ascii="Courier New" w:hAnsi="Courier New" w:cs="Courier New"/>
         </w:rPr>
-        <w:t xml:space="preserve">Added notes to emphasise that the appropriate </w:t>
-      </w:r>
-      <w:proofErr w:type="gramStart"/>
-      <w:r>
-        <w:rPr>
-          <w:rFonts w:ascii="Courier New" w:hAnsi="Courier New" w:cs="Courier New"/>
-        </w:rPr>
-        <w:t>time period</w:t>
-      </w:r>
-      <w:proofErr w:type="gramEnd"/>
-      <w:r>
-        <w:rPr>
-          <w:rFonts w:ascii="Courier New" w:hAnsi="Courier New" w:cs="Courier New"/>
-        </w:rPr>
-        <w:t xml:space="preserve"> for comparison is one day.</w:t>
+        <w:lastRenderedPageBreak/>
+        <w:t>Added notes to emphasise that the appropriate time period for comparison is one day.</w:t>
       </w:r>
     </w:p>
     <w:p>
@@ -705,7 +732,6 @@
         <w:rPr>
           <w:rFonts w:ascii="Courier New" w:hAnsi="Courier New" w:cs="Courier New"/>
         </w:rPr>
-        <w:lastRenderedPageBreak/>
         <w:t>========================================</w:t>
       </w:r>
     </w:p>
@@ -773,21 +799,7 @@
         <w:rPr>
           <w:rFonts w:ascii="Courier New" w:hAnsi="Courier New" w:cs="Courier New"/>
         </w:rPr>
-        <w:t xml:space="preserve">Fixed checkbox </w:t>
-      </w:r>
-      <w:proofErr w:type="gramStart"/>
-      <w:r>
-        <w:rPr>
-          <w:rFonts w:ascii="Courier New" w:hAnsi="Courier New" w:cs="Courier New"/>
-        </w:rPr>
-        <w:t>selection;</w:t>
-      </w:r>
-      <w:proofErr w:type="gramEnd"/>
-      <w:r>
-        <w:rPr>
-          <w:rFonts w:ascii="Courier New" w:hAnsi="Courier New" w:cs="Courier New"/>
-        </w:rPr>
-        <w:t xml:space="preserve"> this was not working on some browsers/devices</w:t>
+        <w:t>Fixed checkbox selection; this was not working on some browsers/devices</w:t>
       </w:r>
     </w:p>
     <w:p>
@@ -889,35 +901,7 @@
         <w:rPr>
           <w:rFonts w:ascii="Courier New" w:hAnsi="Courier New" w:cs="Courier New"/>
         </w:rPr>
-        <w:t xml:space="preserve">The URL of the chart now updates based on the user selection. This means a specific configuration can be shared with others. Copy the URL from the browser </w:t>
-      </w:r>
-      <w:proofErr w:type="gramStart"/>
-      <w:r>
-        <w:rPr>
-          <w:rFonts w:ascii="Courier New" w:hAnsi="Courier New" w:cs="Courier New"/>
-        </w:rPr>
-        <w:t>bar, or</w:t>
-      </w:r>
-      <w:proofErr w:type="gramEnd"/>
-      <w:r>
-        <w:rPr>
-          <w:rFonts w:ascii="Courier New" w:hAnsi="Courier New" w:cs="Courier New"/>
-        </w:rPr>
-        <w:t xml:space="preserve"> use the “Share” button in the </w:t>
-      </w:r>
-      <w:proofErr w:type="gramStart"/>
-      <w:r>
-        <w:rPr>
-          <w:rFonts w:ascii="Courier New" w:hAnsi="Courier New" w:cs="Courier New"/>
-        </w:rPr>
-        <w:t>bottom-right</w:t>
-      </w:r>
-      <w:proofErr w:type="gramEnd"/>
-      <w:r>
-        <w:rPr>
-          <w:rFonts w:ascii="Courier New" w:hAnsi="Courier New" w:cs="Courier New"/>
-        </w:rPr>
-        <w:t>.</w:t>
+        <w:t>The URL of the chart now updates based on the user selection. This means a specific configuration can be shared with others. Copy the URL from the browser bar, or use the “Share” button in the bottom-right.</w:t>
       </w:r>
     </w:p>
     <w:p>
@@ -935,21 +919,7 @@
         <w:rPr>
           <w:rFonts w:ascii="Courier New" w:hAnsi="Courier New" w:cs="Courier New"/>
         </w:rPr>
-        <w:t xml:space="preserve">An image of the chart can now be downloaded. Use the “Share” button in the </w:t>
-      </w:r>
-      <w:proofErr w:type="gramStart"/>
-      <w:r>
-        <w:rPr>
-          <w:rFonts w:ascii="Courier New" w:hAnsi="Courier New" w:cs="Courier New"/>
-        </w:rPr>
-        <w:t>bottom-right</w:t>
-      </w:r>
-      <w:proofErr w:type="gramEnd"/>
-      <w:r>
-        <w:rPr>
-          <w:rFonts w:ascii="Courier New" w:hAnsi="Courier New" w:cs="Courier New"/>
-        </w:rPr>
-        <w:t xml:space="preserve">. </w:t>
+        <w:t xml:space="preserve">An image of the chart can now be downloaded. Use the “Share” button in the bottom-right. </w:t>
       </w:r>
     </w:p>
     <w:p>
@@ -991,7 +961,7 @@
 </file>
 
 <file path=word/numbering.xml><?xml version="1.0" encoding="utf-8"?>
-<w:numbering xmlns:wpc="http://schemas.microsoft.com/office/word/2010/wordprocessingCanvas" xmlns:cx="http://schemas.microsoft.com/office/drawing/2014/chartex" xmlns:cx1="http://schemas.microsoft.com/office/drawing/2015/9/8/chartex" xmlns:cx2="http://schemas.microsoft.com/office/drawing/2015/10/21/chartex" xmlns:cx3="http://schemas.microsoft.com/office/drawing/2016/5/9/chartex" xmlns:cx4="http://schemas.microsoft.com/office/drawing/2016/5/10/chartex" xmlns:cx5="http://schemas.microsoft.com/office/drawing/2016/5/11/chartex" xmlns:cx6="http://schemas.microsoft.com/office/drawing/2016/5/12/chartex" xmlns:cx7="http://schemas.microsoft.com/office/drawing/2016/5/13/chartex" xmlns:cx8="http://schemas.microsoft.com/office/drawing/2016/5/14/chartex" xmlns:mc="http://schemas.openxmlformats.org/markup-compatibility/2006" xmlns:aink="http://schemas.microsoft.com/office/drawing/2016/ink" xmlns:am3d="http://schemas.microsoft.com/office/drawing/2017/model3d" xmlns:o="urn:schemas-microsoft-com:office:office" xmlns:oel="http://schemas.microsoft.com/office/2019/extlst" xmlns:r="http://schemas.openxmlformats.org/officeDocument/2006/relationships" xmlns:m="http://schemas.openxmlformats.org/officeDocument/2006/math" xmlns:v="urn:schemas-microsoft-com:vml" xmlns:wp14="http://schemas.microsoft.com/office/word/2010/wordprocessingDrawing" xmlns:wp="http://schemas.openxmlformats.org/drawingml/2006/wordprocessingDrawing" xmlns:w10="urn:schemas-microsoft-com:office:word" xmlns:w="http://schemas.openxmlformats.org/wordprocessingml/2006/main" xmlns:w14="http://schemas.microsoft.com/office/word/2010/wordml" xmlns:w15="http://schemas.microsoft.com/office/word/2012/wordml" xmlns:w16cex="http://schemas.microsoft.com/office/word/2018/wordml/cex" xmlns:w16cid="http://schemas.microsoft.com/office/word/2016/wordml/cid" xmlns:w16="http://schemas.microsoft.com/office/word/2018/wordml" xmlns:w16du="http://schemas.microsoft.com/office/word/2023/wordml/word16du" xmlns:w16sdtdh="http://schemas.microsoft.com/office/word/2020/wordml/sdtdatahash" xmlns:w16sdtfl="http://schemas.microsoft.com/office/word/2024/wordml/sdtformatlock" xmlns:w16se="http://schemas.microsoft.com/office/word/2015/wordml/symex" xmlns:wpg="http://schemas.microsoft.com/office/word/2010/wordprocessingGroup" xmlns:wpi="http://schemas.microsoft.com/office/word/2010/wordprocessingInk" xmlns:wne="http://schemas.microsoft.com/office/word/2006/wordml" xmlns:wps="http://schemas.microsoft.com/office/word/2010/wordprocessingShape" mc:Ignorable="w14 w15 w16se w16cid w16 w16cex w16sdtdh w16sdtfl w16du wp14">
+<w:numbering xmlns:wpc="http://schemas.microsoft.com/office/word/2010/wordprocessingCanvas" xmlns:cx="http://schemas.microsoft.com/office/drawing/2014/chartex" xmlns:cx1="http://schemas.microsoft.com/office/drawing/2015/9/8/chartex" xmlns:cx2="http://schemas.microsoft.com/office/drawing/2015/10/21/chartex" xmlns:cx3="http://schemas.microsoft.com/office/drawing/2016/5/9/chartex" xmlns:cx4="http://schemas.microsoft.com/office/drawing/2016/5/10/chartex" xmlns:cx5="http://schemas.microsoft.com/office/drawing/2016/5/11/chartex" xmlns:cx6="http://schemas.microsoft.com/office/drawing/2016/5/12/chartex" xmlns:cx7="http://schemas.microsoft.com/office/drawing/2016/5/13/chartex" xmlns:cx8="http://schemas.microsoft.com/office/drawing/2016/5/14/chartex" xmlns:mc="http://schemas.openxmlformats.org/markup-compatibility/2006" xmlns:aink="http://schemas.microsoft.com/office/drawing/2016/ink" xmlns:am3d="http://schemas.microsoft.com/office/drawing/2017/model3d" xmlns:o="urn:schemas-microsoft-com:office:office" xmlns:r="http://schemas.openxmlformats.org/officeDocument/2006/relationships" xmlns:m="http://schemas.openxmlformats.org/officeDocument/2006/math" xmlns:v="urn:schemas-microsoft-com:vml" xmlns:wp14="http://schemas.microsoft.com/office/word/2010/wordprocessingDrawing" xmlns:wp="http://schemas.openxmlformats.org/drawingml/2006/wordprocessingDrawing" xmlns:w10="urn:schemas-microsoft-com:office:word" xmlns:w="http://schemas.openxmlformats.org/wordprocessingml/2006/main" xmlns:w14="http://schemas.microsoft.com/office/word/2010/wordml" xmlns:w15="http://schemas.microsoft.com/office/word/2012/wordml" xmlns:w16cex="http://schemas.microsoft.com/office/word/2018/wordml/cex" xmlns:w16cid="http://schemas.microsoft.com/office/word/2016/wordml/cid" xmlns:w16="http://schemas.microsoft.com/office/word/2018/wordml" xmlns:w16sdtdh="http://schemas.microsoft.com/office/word/2020/wordml/sdtdatahash" xmlns:w16se="http://schemas.microsoft.com/office/word/2015/wordml/symex" xmlns:wpg="http://schemas.microsoft.com/office/word/2010/wordprocessingGroup" xmlns:wpi="http://schemas.microsoft.com/office/word/2010/wordprocessingInk" xmlns:wne="http://schemas.microsoft.com/office/word/2006/wordml" xmlns:wps="http://schemas.microsoft.com/office/word/2010/wordprocessingShape" mc:Ignorable="w14 w15 w16se w16cid w16 w16cex w16sdtdh wp14">
   <w:abstractNum w:abstractNumId="0" w15:restartNumberingAfterBreak="0">
     <w:nsid w:val="1CDE3408"/>
     <w:multiLevelType w:val="hybridMultilevel"/>
@@ -2004,38 +1974,38 @@
       </w:rPr>
     </w:lvl>
   </w:abstractNum>
-  <w:num w:numId="1" w16cid:durableId="857698144">
+  <w:num w:numId="1">
     <w:abstractNumId w:val="8"/>
   </w:num>
-  <w:num w:numId="2" w16cid:durableId="1872179597">
+  <w:num w:numId="2">
     <w:abstractNumId w:val="4"/>
   </w:num>
-  <w:num w:numId="3" w16cid:durableId="1201673090">
+  <w:num w:numId="3">
     <w:abstractNumId w:val="3"/>
   </w:num>
-  <w:num w:numId="4" w16cid:durableId="447746796">
+  <w:num w:numId="4">
     <w:abstractNumId w:val="6"/>
   </w:num>
-  <w:num w:numId="5" w16cid:durableId="1313024706">
+  <w:num w:numId="5">
     <w:abstractNumId w:val="7"/>
   </w:num>
-  <w:num w:numId="6" w16cid:durableId="1438021343">
+  <w:num w:numId="6">
     <w:abstractNumId w:val="0"/>
   </w:num>
-  <w:num w:numId="7" w16cid:durableId="106510689">
+  <w:num w:numId="7">
     <w:abstractNumId w:val="1"/>
   </w:num>
-  <w:num w:numId="8" w16cid:durableId="863176197">
+  <w:num w:numId="8">
     <w:abstractNumId w:val="5"/>
   </w:num>
-  <w:num w:numId="9" w16cid:durableId="1785729992">
+  <w:num w:numId="9">
     <w:abstractNumId w:val="2"/>
   </w:num>
 </w:numbering>
 </file>
 
 <file path=word/styles.xml><?xml version="1.0" encoding="utf-8"?>
-<w:styles xmlns:mc="http://schemas.openxmlformats.org/markup-compatibility/2006" xmlns:r="http://schemas.openxmlformats.org/officeDocument/2006/relationships" xmlns:w="http://schemas.openxmlformats.org/wordprocessingml/2006/main" xmlns:w14="http://schemas.microsoft.com/office/word/2010/wordml" xmlns:w15="http://schemas.microsoft.com/office/word/2012/wordml" xmlns:w16cex="http://schemas.microsoft.com/office/word/2018/wordml/cex" xmlns:w16cid="http://schemas.microsoft.com/office/word/2016/wordml/cid" xmlns:w16="http://schemas.microsoft.com/office/word/2018/wordml" xmlns:w16du="http://schemas.microsoft.com/office/word/2023/wordml/word16du" xmlns:w16sdtdh="http://schemas.microsoft.com/office/word/2020/wordml/sdtdatahash" xmlns:w16sdtfl="http://schemas.microsoft.com/office/word/2024/wordml/sdtformatlock" xmlns:w16se="http://schemas.microsoft.com/office/word/2015/wordml/symex" mc:Ignorable="w14 w15 w16se w16cid w16 w16cex w16sdtdh w16sdtfl w16du">
+<w:styles xmlns:mc="http://schemas.openxmlformats.org/markup-compatibility/2006" xmlns:r="http://schemas.openxmlformats.org/officeDocument/2006/relationships" xmlns:w="http://schemas.openxmlformats.org/wordprocessingml/2006/main" xmlns:w14="http://schemas.microsoft.com/office/word/2010/wordml" xmlns:w15="http://schemas.microsoft.com/office/word/2012/wordml" xmlns:w16cex="http://schemas.microsoft.com/office/word/2018/wordml/cex" xmlns:w16cid="http://schemas.microsoft.com/office/word/2016/wordml/cid" xmlns:w16="http://schemas.microsoft.com/office/word/2018/wordml" xmlns:w16sdtdh="http://schemas.microsoft.com/office/word/2020/wordml/sdtdatahash" xmlns:w16se="http://schemas.microsoft.com/office/word/2015/wordml/symex" mc:Ignorable="w14 w15 w16se w16cid w16 w16cex w16sdtdh">
   <w:docDefaults>
     <w:rPrDefault>
       <w:rPr>

</xml_diff>